<commit_message>
bai 5, bai 6
</commit_message>
<xml_diff>
--- a/TH_Tuan04/TH_Tuan04.docx
+++ b/TH_Tuan04/TH_Tuan04.docx
@@ -3606,19 +3606,188 @@
         <w:rPr>
           <w:lang w:val="en-US"/>
         </w:rPr>
-        <w:tab/>
-      </w:r>
-      <w:r>
-        <w:rPr>
-          <w:lang w:val="en-US"/>
-        </w:rPr>
-        <w:tab/>
-      </w:r>
-      <w:r>
-        <w:rPr>
-          <w:lang w:val="en-US"/>
-        </w:rPr>
-        <w:tab/>
+        <w:drawing>
+          <wp:inline distT="0" distB="0" distL="0" distR="0" wp14:anchorId="5C82B7B2" wp14:editId="578E7006">
+            <wp:extent cx="4917831" cy="1909337"/>
+            <wp:effectExtent l="0" t="0" r="0" b="0"/>
+            <wp:docPr id="1866200873" name="Picture 1"/>
+            <wp:cNvGraphicFramePr>
+              <a:graphicFrameLocks xmlns:a="http://schemas.openxmlformats.org/drawingml/2006/main" noChangeAspect="1"/>
+            </wp:cNvGraphicFramePr>
+            <a:graphic xmlns:a="http://schemas.openxmlformats.org/drawingml/2006/main">
+              <a:graphicData uri="http://schemas.openxmlformats.org/drawingml/2006/picture">
+                <pic:pic xmlns:pic="http://schemas.openxmlformats.org/drawingml/2006/picture">
+                  <pic:nvPicPr>
+                    <pic:cNvPr id="1866200873" name=""/>
+                    <pic:cNvPicPr/>
+                  </pic:nvPicPr>
+                  <pic:blipFill>
+                    <a:blip r:embed="rId50"/>
+                    <a:stretch>
+                      <a:fillRect/>
+                    </a:stretch>
+                  </pic:blipFill>
+                  <pic:spPr>
+                    <a:xfrm>
+                      <a:off x="0" y="0"/>
+                      <a:ext cx="4922412" cy="1911115"/>
+                    </a:xfrm>
+                    <a:prstGeom prst="rect">
+                      <a:avLst/>
+                    </a:prstGeom>
+                  </pic:spPr>
+                </pic:pic>
+              </a:graphicData>
+            </a:graphic>
+          </wp:inline>
+        </w:drawing>
+      </w:r>
+      <w:r>
+        <w:rPr>
+          <w:noProof/>
+        </w:rPr>
+        <w:t xml:space="preserve"> </w:t>
+      </w:r>
+      <w:r>
+        <w:rPr>
+          <w:lang w:val="en-US"/>
+        </w:rPr>
+        <w:drawing>
+          <wp:inline distT="0" distB="0" distL="0" distR="0" wp14:anchorId="714A29D2" wp14:editId="2E06C5FB">
+            <wp:extent cx="5539154" cy="1865914"/>
+            <wp:effectExtent l="0" t="0" r="4445" b="1270"/>
+            <wp:docPr id="1051778357" name="Picture 1"/>
+            <wp:cNvGraphicFramePr>
+              <a:graphicFrameLocks xmlns:a="http://schemas.openxmlformats.org/drawingml/2006/main" noChangeAspect="1"/>
+            </wp:cNvGraphicFramePr>
+            <a:graphic xmlns:a="http://schemas.openxmlformats.org/drawingml/2006/main">
+              <a:graphicData uri="http://schemas.openxmlformats.org/drawingml/2006/picture">
+                <pic:pic xmlns:pic="http://schemas.openxmlformats.org/drawingml/2006/picture">
+                  <pic:nvPicPr>
+                    <pic:cNvPr id="1051778357" name=""/>
+                    <pic:cNvPicPr/>
+                  </pic:nvPicPr>
+                  <pic:blipFill>
+                    <a:blip r:embed="rId51"/>
+                    <a:stretch>
+                      <a:fillRect/>
+                    </a:stretch>
+                  </pic:blipFill>
+                  <pic:spPr>
+                    <a:xfrm>
+                      <a:off x="0" y="0"/>
+                      <a:ext cx="5541333" cy="1866648"/>
+                    </a:xfrm>
+                    <a:prstGeom prst="rect">
+                      <a:avLst/>
+                    </a:prstGeom>
+                  </pic:spPr>
+                </pic:pic>
+              </a:graphicData>
+            </a:graphic>
+          </wp:inline>
+        </w:drawing>
+      </w:r>
+      <w:r>
+        <w:rPr>
+          <w:lang w:val="en-US"/>
+        </w:rPr>
+        <w:tab/>
+      </w:r>
+    </w:p>
+    <w:p>
+      <w:pPr>
+        <w:rPr>
+          <w:lang w:val="en-US"/>
+        </w:rPr>
+      </w:pPr>
+      <w:r>
+        <w:rPr>
+          <w:lang w:val="en-US"/>
+        </w:rPr>
+        <w:lastRenderedPageBreak/>
+        <w:drawing>
+          <wp:inline distT="0" distB="0" distL="0" distR="0" wp14:anchorId="1FDB6749" wp14:editId="7165C8E5">
+            <wp:extent cx="5943600" cy="2091690"/>
+            <wp:effectExtent l="0" t="0" r="0" b="3810"/>
+            <wp:docPr id="1172131402" name="Picture 1"/>
+            <wp:cNvGraphicFramePr>
+              <a:graphicFrameLocks xmlns:a="http://schemas.openxmlformats.org/drawingml/2006/main" noChangeAspect="1"/>
+            </wp:cNvGraphicFramePr>
+            <a:graphic xmlns:a="http://schemas.openxmlformats.org/drawingml/2006/main">
+              <a:graphicData uri="http://schemas.openxmlformats.org/drawingml/2006/picture">
+                <pic:pic xmlns:pic="http://schemas.openxmlformats.org/drawingml/2006/picture">
+                  <pic:nvPicPr>
+                    <pic:cNvPr id="1172131402" name=""/>
+                    <pic:cNvPicPr/>
+                  </pic:nvPicPr>
+                  <pic:blipFill>
+                    <a:blip r:embed="rId52"/>
+                    <a:stretch>
+                      <a:fillRect/>
+                    </a:stretch>
+                  </pic:blipFill>
+                  <pic:spPr>
+                    <a:xfrm>
+                      <a:off x="0" y="0"/>
+                      <a:ext cx="5943600" cy="2091690"/>
+                    </a:xfrm>
+                    <a:prstGeom prst="rect">
+                      <a:avLst/>
+                    </a:prstGeom>
+                  </pic:spPr>
+                </pic:pic>
+              </a:graphicData>
+            </a:graphic>
+          </wp:inline>
+        </w:drawing>
+      </w:r>
+    </w:p>
+    <w:p>
+      <w:pPr>
+        <w:rPr>
+          <w:lang w:val="en-US"/>
+        </w:rPr>
+      </w:pPr>
+      <w:r>
+        <w:rPr>
+          <w:lang w:val="en-US"/>
+        </w:rPr>
+        <w:drawing>
+          <wp:inline distT="0" distB="0" distL="0" distR="0" wp14:anchorId="2803A9E5" wp14:editId="5079CE7A">
+            <wp:extent cx="5943600" cy="1938020"/>
+            <wp:effectExtent l="0" t="0" r="0" b="5080"/>
+            <wp:docPr id="870781754" name="Picture 1"/>
+            <wp:cNvGraphicFramePr>
+              <a:graphicFrameLocks xmlns:a="http://schemas.openxmlformats.org/drawingml/2006/main" noChangeAspect="1"/>
+            </wp:cNvGraphicFramePr>
+            <a:graphic xmlns:a="http://schemas.openxmlformats.org/drawingml/2006/main">
+              <a:graphicData uri="http://schemas.openxmlformats.org/drawingml/2006/picture">
+                <pic:pic xmlns:pic="http://schemas.openxmlformats.org/drawingml/2006/picture">
+                  <pic:nvPicPr>
+                    <pic:cNvPr id="870781754" name=""/>
+                    <pic:cNvPicPr/>
+                  </pic:nvPicPr>
+                  <pic:blipFill>
+                    <a:blip r:embed="rId53"/>
+                    <a:stretch>
+                      <a:fillRect/>
+                    </a:stretch>
+                  </pic:blipFill>
+                  <pic:spPr>
+                    <a:xfrm>
+                      <a:off x="0" y="0"/>
+                      <a:ext cx="5943600" cy="1938020"/>
+                    </a:xfrm>
+                    <a:prstGeom prst="rect">
+                      <a:avLst/>
+                    </a:prstGeom>
+                  </pic:spPr>
+                </pic:pic>
+              </a:graphicData>
+            </a:graphic>
+          </wp:inline>
+        </w:drawing>
       </w:r>
     </w:p>
     <w:p>
@@ -3709,20 +3878,49 @@
         <w:rPr>
           <w:lang w:val="en-US"/>
         </w:rPr>
-        <w:tab/>
-      </w:r>
-      <w:r>
-        <w:rPr>
-          <w:lang w:val="en-US"/>
-        </w:rPr>
-        <w:tab/>
-      </w:r>
-      <w:r>
-        <w:rPr>
-          <w:lang w:val="en-US"/>
-        </w:rPr>
-        <w:tab/>
-      </w:r>
+        <w:drawing>
+          <wp:inline distT="0" distB="0" distL="0" distR="0" wp14:anchorId="264CAC2F" wp14:editId="3FCDC31D">
+            <wp:extent cx="5943600" cy="2130425"/>
+            <wp:effectExtent l="0" t="0" r="0" b="3175"/>
+            <wp:docPr id="2065837694" name="Picture 1"/>
+            <wp:cNvGraphicFramePr>
+              <a:graphicFrameLocks xmlns:a="http://schemas.openxmlformats.org/drawingml/2006/main" noChangeAspect="1"/>
+            </wp:cNvGraphicFramePr>
+            <a:graphic xmlns:a="http://schemas.openxmlformats.org/drawingml/2006/main">
+              <a:graphicData uri="http://schemas.openxmlformats.org/drawingml/2006/picture">
+                <pic:pic xmlns:pic="http://schemas.openxmlformats.org/drawingml/2006/picture">
+                  <pic:nvPicPr>
+                    <pic:cNvPr id="2065837694" name=""/>
+                    <pic:cNvPicPr/>
+                  </pic:nvPicPr>
+                  <pic:blipFill>
+                    <a:blip r:embed="rId54"/>
+                    <a:stretch>
+                      <a:fillRect/>
+                    </a:stretch>
+                  </pic:blipFill>
+                  <pic:spPr>
+                    <a:xfrm>
+                      <a:off x="0" y="0"/>
+                      <a:ext cx="5943600" cy="2130425"/>
+                    </a:xfrm>
+                    <a:prstGeom prst="rect">
+                      <a:avLst/>
+                    </a:prstGeom>
+                  </pic:spPr>
+                </pic:pic>
+              </a:graphicData>
+            </a:graphic>
+          </wp:inline>
+        </w:drawing>
+      </w:r>
+    </w:p>
+    <w:p>
+      <w:pPr>
+        <w:rPr>
+          <w:lang w:val="en-US"/>
+        </w:rPr>
+      </w:pPr>
     </w:p>
     <w:p>
       <w:pPr>
@@ -3838,19 +4036,48 @@
         <w:rPr>
           <w:lang w:val="en-US"/>
         </w:rPr>
-        <w:tab/>
-      </w:r>
-      <w:r>
-        <w:rPr>
-          <w:lang w:val="en-US"/>
-        </w:rPr>
-        <w:tab/>
-      </w:r>
-      <w:r>
-        <w:rPr>
-          <w:lang w:val="en-US"/>
-        </w:rPr>
-        <w:tab/>
+        <w:lastRenderedPageBreak/>
+        <w:tab/>
+      </w:r>
+      <w:r>
+        <w:rPr>
+          <w:lang w:val="en-US"/>
+        </w:rPr>
+        <w:drawing>
+          <wp:inline distT="0" distB="0" distL="0" distR="0" wp14:anchorId="3D743A03" wp14:editId="0941701B">
+            <wp:extent cx="5943600" cy="3865245"/>
+            <wp:effectExtent l="0" t="0" r="0" b="1905"/>
+            <wp:docPr id="988878949" name="Picture 1"/>
+            <wp:cNvGraphicFramePr>
+              <a:graphicFrameLocks xmlns:a="http://schemas.openxmlformats.org/drawingml/2006/main" noChangeAspect="1"/>
+            </wp:cNvGraphicFramePr>
+            <a:graphic xmlns:a="http://schemas.openxmlformats.org/drawingml/2006/main">
+              <a:graphicData uri="http://schemas.openxmlformats.org/drawingml/2006/picture">
+                <pic:pic xmlns:pic="http://schemas.openxmlformats.org/drawingml/2006/picture">
+                  <pic:nvPicPr>
+                    <pic:cNvPr id="988878949" name=""/>
+                    <pic:cNvPicPr/>
+                  </pic:nvPicPr>
+                  <pic:blipFill>
+                    <a:blip r:embed="rId55"/>
+                    <a:stretch>
+                      <a:fillRect/>
+                    </a:stretch>
+                  </pic:blipFill>
+                  <pic:spPr>
+                    <a:xfrm>
+                      <a:off x="0" y="0"/>
+                      <a:ext cx="5943600" cy="3865245"/>
+                    </a:xfrm>
+                    <a:prstGeom prst="rect">
+                      <a:avLst/>
+                    </a:prstGeom>
+                  </pic:spPr>
+                </pic:pic>
+              </a:graphicData>
+            </a:graphic>
+          </wp:inline>
+        </w:drawing>
       </w:r>
     </w:p>
     <w:p>
@@ -4147,7 +4374,6 @@
         <w:rPr>
           <w:lang w:val="en-US"/>
         </w:rPr>
-        <w:lastRenderedPageBreak/>
         <w:tab/>
       </w:r>
       <w:r>

</xml_diff>